<commit_message>
feat: add Orchard branding, peacock cover logo, header logo to research doc
- Replace "R&D Research Journal" with "The Orchard" on cover and headers
- Add peacock mascot image on cover page
- Add HaPardes tree logo in page headers
- TOC with clickable hyperlinks (\h flag)
</commit_message>
<xml_diff>
--- a/argos_research/research_documentation.docx
+++ b/argos_research/research_documentation.docx
@@ -4,6 +4,45 @@
   <w:body>
     <w:p/>
     <w:p/>
+    <w:p>
+      <w:pPr>
+        <w:jc w:val="center"/>
+      </w:pPr>
+      <w:r>
+        <w:drawing>
+          <wp:inline xmlns:a="http://schemas.openxmlformats.org/drawingml/2006/main" xmlns:pic="http://schemas.openxmlformats.org/drawingml/2006/picture">
+            <wp:extent cx="2286000" cy="2286000"/>
+            <wp:docPr id="1" name="Picture 1"/>
+            <wp:cNvGraphicFramePr>
+              <a:graphicFrameLocks noChangeAspect="1"/>
+            </wp:cNvGraphicFramePr>
+            <a:graphic>
+              <a:graphicData uri="http://schemas.openxmlformats.org/drawingml/2006/picture">
+                <pic:pic>
+                  <pic:nvPicPr>
+                    <pic:cNvPr id="0" name="peacock.png"/>
+                    <pic:cNvPicPr/>
+                  </pic:nvPicPr>
+                  <pic:blipFill>
+                    <a:blip r:embed="rId11"/>
+                    <a:stretch>
+                      <a:fillRect/>
+                    </a:stretch>
+                  </pic:blipFill>
+                  <pic:spPr>
+                    <a:xfrm>
+                      <a:off x="0" y="0"/>
+                      <a:ext cx="2286000" cy="2286000"/>
+                    </a:xfrm>
+                    <a:prstGeom prst="rect"/>
+                  </pic:spPr>
+                </pic:pic>
+              </a:graphicData>
+            </a:graphic>
+          </wp:inline>
+        </w:drawing>
+      </w:r>
+    </w:p>
     <w:p/>
     <w:p>
       <w:pPr>
@@ -42,7 +81,7 @@
           <w:color w:val="2A5A8C"/>
           <w:sz w:val="40"/>
         </w:rPr>
-        <w:t>R&amp;D Research Journal</w:t>
+        <w:t>The Orchard</w:t>
       </w:r>
     </w:p>
     <w:p/>
@@ -60,7 +99,6 @@
         <w:t>Detailed Edition v2.0</w:t>
       </w:r>
     </w:p>
-    <w:p/>
     <w:p/>
     <w:p/>
     <w:p>
@@ -27174,13 +27212,47 @@
       <w:jc w:val="right"/>
     </w:pPr>
     <w:r>
+      <w:drawing>
+        <wp:inline distT="0" distB="0" distL="0" distR="0">
+          <wp:extent cx="274320" cy="274320"/>
+          <wp:docPr id="10" name="Header Logo"/>
+          <a:graphic xmlns:a="http://schemas.openxmlformats.org/drawingml/2006/main">
+            <a:graphicData uri="http://schemas.openxmlformats.org/drawingml/2006/picture">
+              <pic:pic xmlns:pic="http://schemas.openxmlformats.org/drawingml/2006/picture">
+                <pic:nvPicPr>
+                  <pic:cNvPr id="0" name="Header Logo"/>
+                  <pic:cNvPicPr/>
+                </pic:nvPicPr>
+                <pic:blipFill>
+                  <a:blip r:embed="rId1"/>
+                  <a:stretch>
+                    <a:fillRect/>
+                  </a:stretch>
+                </pic:blipFill>
+                <pic:spPr>
+                  <a:xfrm>
+                    <a:off x="0" y="0"/>
+                    <a:ext cx="274320" cy="274320"/>
+                  </a:xfrm>
+                  <a:prstGeom prst="rect"/>
+                </pic:spPr>
+              </pic:pic>
+            </a:graphicData>
+          </a:graphic>
+        </wp:inline>
+      </w:drawing>
+    </w:r>
+    <w:r>
+      <w:t xml:space="preserve">  </w:t>
+    </w:r>
+    <w:r>
       <w:rPr>
         <w:rFonts w:ascii="Calibri" w:hAnsi="Calibri"/>
         <w:i/>
         <w:color w:val="666666"/>
         <w:sz w:val="16"/>
       </w:rPr>
-      <w:t>Argos R&amp;D Research Journal  |  INTERNAL</w:t>
+      <w:t>Argos — The Orchard  |  INTERNAL</w:t>
     </w:r>
   </w:p>
 </w:hdr>

</xml_diff>

<commit_message>
fix: add real clickable TOC with bookmark hyperlinks
Replace non-functional Word field TOC with pre-populated table of
contents using w:hyperlink anchors pointing to w:bookmarkStart
targets on each chapter heading. All 14 entries clickable.
</commit_message>
<xml_diff>
--- a/argos_research/research_documentation.docx
+++ b/argos_research/research_documentation.docx
@@ -206,10 +206,275 @@
         <w:t>Table of Contents</w:t>
       </w:r>
     </w:p>
+    <w:p/>
     <w:p>
       <w:pPr>
-        <w:spacing w:after="240"/>
-      </w:pPr>
+        <w:spacing w:after="40" w:before="40"/>
+        <w:ind w:left="0"/>
+      </w:pPr>
+      <w:hyperlink w:anchor="ch1" w:history="1">
+        <w:r>
+          <w:rPr>
+            <w:color w:val="1a3a5c"/>
+            <w:u w:val="single"/>
+            <w:sz w:val="22"/>
+            <w:szCs w:val="22"/>
+            <w:rFonts w:ascii="Calibri" w:hAnsi="Calibri"/>
+            <w:b/>
+          </w:rPr>
+          <w:t xml:space="preserve">1. Research Foundation &amp; Literature Review</w:t>
+        </w:r>
+      </w:hyperlink>
+    </w:p>
+    <w:p>
+      <w:pPr>
+        <w:spacing w:after="40" w:before="40"/>
+        <w:ind w:left="0"/>
+      </w:pPr>
+      <w:hyperlink w:anchor="ch2" w:history="1">
+        <w:r>
+          <w:rPr>
+            <w:color w:val="1a3a5c"/>
+            <w:u w:val="single"/>
+            <w:sz w:val="22"/>
+            <w:szCs w:val="22"/>
+            <w:rFonts w:ascii="Calibri" w:hAnsi="Calibri"/>
+            <w:b/>
+          </w:rPr>
+          <w:t xml:space="preserve">2. Environment &amp; Infrastructure Setup</w:t>
+        </w:r>
+      </w:hyperlink>
+    </w:p>
+    <w:p>
+      <w:pPr>
+        <w:spacing w:after="40" w:before="40"/>
+        <w:ind w:left="0"/>
+      </w:pPr>
+      <w:hyperlink w:anchor="ch3" w:history="1">
+        <w:r>
+          <w:rPr>
+            <w:color w:val="1a3a5c"/>
+            <w:u w:val="single"/>
+            <w:sz w:val="22"/>
+            <w:szCs w:val="22"/>
+            <w:rFonts w:ascii="Calibri" w:hAnsi="Calibri"/>
+            <w:b/>
+          </w:rPr>
+          <w:t xml:space="preserve">3. Building the Pipeline from Scratch</w:t>
+        </w:r>
+      </w:hyperlink>
+    </w:p>
+    <w:p>
+      <w:pPr>
+        <w:spacing w:after="40" w:before="40"/>
+        <w:ind w:left="0"/>
+      </w:pPr>
+      <w:hyperlink w:anchor="ch4" w:history="1">
+        <w:r>
+          <w:rPr>
+            <w:color w:val="1a3a5c"/>
+            <w:u w:val="single"/>
+            <w:sz w:val="22"/>
+            <w:szCs w:val="22"/>
+            <w:rFonts w:ascii="Calibri" w:hAnsi="Calibri"/>
+            <w:b/>
+          </w:rPr>
+          <w:t xml:space="preserve">4. Video Normalization</w:t>
+        </w:r>
+      </w:hyperlink>
+    </w:p>
+    <w:p>
+      <w:pPr>
+        <w:spacing w:after="40" w:before="40"/>
+        <w:ind w:left="0"/>
+      </w:pPr>
+      <w:hyperlink w:anchor="ch5" w:history="1">
+        <w:r>
+          <w:rPr>
+            <w:color w:val="1a3a5c"/>
+            <w:u w:val="single"/>
+            <w:sz w:val="22"/>
+            <w:szCs w:val="22"/>
+            <w:rFonts w:ascii="Calibri" w:hAnsi="Calibri"/>
+            <w:b/>
+          </w:rPr>
+          <w:t xml:space="preserve">5. Video Segmentation</w:t>
+        </w:r>
+      </w:hyperlink>
+    </w:p>
+    <w:p>
+      <w:pPr>
+        <w:spacing w:after="40" w:before="40"/>
+        <w:ind w:left="0"/>
+      </w:pPr>
+      <w:hyperlink w:anchor="ch6" w:history="1">
+        <w:r>
+          <w:rPr>
+            <w:color w:val="1a3a5c"/>
+            <w:u w:val="single"/>
+            <w:sz w:val="22"/>
+            <w:szCs w:val="22"/>
+            <w:rFonts w:ascii="Calibri" w:hAnsi="Calibri"/>
+            <w:b/>
+          </w:rPr>
+          <w:t xml:space="preserve">6. Face Detection &amp; Mouth Cropping</w:t>
+        </w:r>
+      </w:hyperlink>
+    </w:p>
+    <w:p>
+      <w:pPr>
+        <w:spacing w:after="40" w:before="40"/>
+        <w:ind w:left="0"/>
+      </w:pPr>
+      <w:hyperlink w:anchor="ch7" w:history="1">
+        <w:r>
+          <w:rPr>
+            <w:color w:val="1a3a5c"/>
+            <w:u w:val="single"/>
+            <w:sz w:val="22"/>
+            <w:szCs w:val="22"/>
+            <w:rFonts w:ascii="Calibri" w:hAnsi="Calibri"/>
+            <w:b/>
+          </w:rPr>
+          <w:t xml:space="preserve">7. Reports &amp; Burned Videos</w:t>
+        </w:r>
+      </w:hyperlink>
+    </w:p>
+    <w:p>
+      <w:pPr>
+        <w:spacing w:after="40" w:before="40"/>
+        <w:ind w:left="0"/>
+      </w:pPr>
+      <w:hyperlink w:anchor="ch8" w:history="1">
+        <w:r>
+          <w:rPr>
+            <w:color w:val="1a3a5c"/>
+            <w:u w:val="single"/>
+            <w:sz w:val="22"/>
+            <w:szCs w:val="22"/>
+            <w:rFonts w:ascii="Calibri" w:hAnsi="Calibri"/>
+            <w:b/>
+          </w:rPr>
+          <w:t xml:space="preserve">8. Modular Code Refactoring</w:t>
+        </w:r>
+      </w:hyperlink>
+    </w:p>
+    <w:p>
+      <w:pPr>
+        <w:spacing w:after="40" w:before="40"/>
+        <w:ind w:left="0"/>
+      </w:pPr>
+      <w:hyperlink w:anchor="ch9" w:history="1">
+        <w:r>
+          <w:rPr>
+            <w:color w:val="1a3a5c"/>
+            <w:u w:val="single"/>
+            <w:sz w:val="22"/>
+            <w:szCs w:val="22"/>
+            <w:rFonts w:ascii="Calibri" w:hAnsi="Calibri"/>
+            <w:b/>
+          </w:rPr>
+          <w:t xml:space="preserve">9. Web UI &amp; Server</w:t>
+        </w:r>
+      </w:hyperlink>
+    </w:p>
+    <w:p>
+      <w:pPr>
+        <w:spacing w:after="40" w:before="40"/>
+        <w:ind w:left="0"/>
+      </w:pPr>
+      <w:hyperlink w:anchor="ch10" w:history="1">
+        <w:r>
+          <w:rPr>
+            <w:color w:val="1a3a5c"/>
+            <w:u w:val="single"/>
+            <w:sz w:val="22"/>
+            <w:szCs w:val="22"/>
+            <w:rFonts w:ascii="Calibri" w:hAnsi="Calibri"/>
+            <w:b/>
+          </w:rPr>
+          <w:t xml:space="preserve">10. Backend Services</w:t>
+        </w:r>
+      </w:hyperlink>
+    </w:p>
+    <w:p>
+      <w:pPr>
+        <w:spacing w:after="40" w:before="40"/>
+        <w:ind w:left="0"/>
+      </w:pPr>
+      <w:hyperlink w:anchor="ch11" w:history="1">
+        <w:r>
+          <w:rPr>
+            <w:color w:val="1a3a5c"/>
+            <w:u w:val="single"/>
+            <w:sz w:val="22"/>
+            <w:szCs w:val="22"/>
+            <w:rFonts w:ascii="Calibri" w:hAnsi="Calibri"/>
+            <w:b/>
+          </w:rPr>
+          <w:t xml:space="preserve">11. Docker Container &amp; Deployment</w:t>
+        </w:r>
+      </w:hyperlink>
+    </w:p>
+    <w:p>
+      <w:pPr>
+        <w:spacing w:after="40" w:before="40"/>
+        <w:ind w:left="0"/>
+      </w:pPr>
+      <w:hyperlink w:anchor="ch12" w:history="1">
+        <w:r>
+          <w:rPr>
+            <w:color w:val="1a3a5c"/>
+            <w:u w:val="single"/>
+            <w:sz w:val="22"/>
+            <w:szCs w:val="22"/>
+            <w:rFonts w:ascii="Calibri" w:hAnsi="Calibri"/>
+            <w:b/>
+          </w:rPr>
+          <w:t xml:space="preserve">12. Performance Evaluation &amp; Tuning</w:t>
+        </w:r>
+      </w:hyperlink>
+    </w:p>
+    <w:p>
+      <w:pPr>
+        <w:spacing w:after="40" w:before="40"/>
+        <w:ind w:left="0"/>
+      </w:pPr>
+      <w:hyperlink w:anchor="ch13" w:history="1">
+        <w:r>
+          <w:rPr>
+            <w:color w:val="1a3a5c"/>
+            <w:u w:val="single"/>
+            <w:sz w:val="22"/>
+            <w:szCs w:val="22"/>
+            <w:rFonts w:ascii="Calibri" w:hAnsi="Calibri"/>
+            <w:b/>
+          </w:rPr>
+          <w:t xml:space="preserve">13. Fine-Tuning &amp; Training Infrastructure</w:t>
+        </w:r>
+      </w:hyperlink>
+    </w:p>
+    <w:p>
+      <w:pPr>
+        <w:spacing w:after="40" w:before="40"/>
+        <w:ind w:left="0"/>
+      </w:pPr>
+      <w:hyperlink w:anchor="ch14" w:history="1">
+        <w:r>
+          <w:rPr>
+            <w:color w:val="1a3a5c"/>
+            <w:u w:val="single"/>
+            <w:sz w:val="22"/>
+            <w:szCs w:val="22"/>
+            <w:rFonts w:ascii="Calibri" w:hAnsi="Calibri"/>
+            <w:b/>
+          </w:rPr>
+          <w:t xml:space="preserve">14. Executive Summary</w:t>
+        </w:r>
+      </w:hyperlink>
+    </w:p>
+    <w:p/>
+    <w:p>
       <w:r>
         <w:rPr>
           <w:rFonts w:ascii="Calibri" w:hAnsi="Calibri"/>
@@ -217,28 +482,7 @@
           <w:color w:val="666666"/>
           <w:sz w:val="18"/>
         </w:rPr>
-        <w:t>This table of contents will update when you open the document in Microsoft Word and press Ctrl+A then F9, or right-click and select 'Update Field'.</w:t>
-      </w:r>
-    </w:p>
-    <w:p>
-      <w:r>
-        <w:fldChar w:fldCharType="begin"/>
-      </w:r>
-      <w:r>
-        <w:instrText xml:space="preserve"> TOC \o "1-3" \h \z \u </w:instrText>
-      </w:r>
-      <w:r>
-        <w:fldChar w:fldCharType="separate"/>
-      </w:r>
-      <w:r>
-        <w:rPr>
-          <w:color w:val="666666"/>
-          <w:sz w:val="20"/>
-        </w:rPr>
-        <w:t>[Table of Contents — Update in Word]</w:t>
-      </w:r>
-      <w:r>
-        <w:fldChar w:fldCharType="end"/>
+        <w:t>Click any chapter title above to jump directly to that section.</w:t>
       </w:r>
     </w:p>
     <w:p>
@@ -247,6 +491,7 @@
       </w:r>
     </w:p>
     <w:p>
+      <w:bookmarkStart w:id="1" w:name="ch1"/>
       <w:pPr>
         <w:pStyle w:val="Heading1"/>
       </w:pPr>
@@ -257,6 +502,7 @@
         </w:rPr>
         <w:t>1. Research Foundation &amp; Literature Review</w:t>
       </w:r>
+      <w:bookmarkEnd w:id="1"/>
     </w:p>
     <w:p>
       <w:pPr>
@@ -2833,6 +3079,7 @@
       </w:r>
     </w:p>
     <w:p>
+      <w:bookmarkStart w:id="2" w:name="ch2"/>
       <w:pPr>
         <w:pStyle w:val="Heading1"/>
       </w:pPr>
@@ -2843,6 +3090,7 @@
         </w:rPr>
         <w:t>2. Environment &amp; Infrastructure Setup</w:t>
       </w:r>
+      <w:bookmarkEnd w:id="2"/>
     </w:p>
     <w:p>
       <w:pPr>
@@ -4357,6 +4605,7 @@
       </w:r>
     </w:p>
     <w:p>
+      <w:bookmarkStart w:id="3" w:name="ch3"/>
       <w:pPr>
         <w:pStyle w:val="Heading1"/>
       </w:pPr>
@@ -4367,6 +4616,7 @@
         </w:rPr>
         <w:t>3. Building the Pipeline from Scratch</w:t>
       </w:r>
+      <w:bookmarkEnd w:id="3"/>
     </w:p>
     <w:p>
       <w:pPr>
@@ -6215,6 +6465,7 @@
       </w:r>
     </w:p>
     <w:p>
+      <w:bookmarkStart w:id="4" w:name="ch4"/>
       <w:pPr>
         <w:pStyle w:val="Heading1"/>
       </w:pPr>
@@ -6225,6 +6476,7 @@
         </w:rPr>
         <w:t>4. Video Normalization</w:t>
       </w:r>
+      <w:bookmarkEnd w:id="4"/>
     </w:p>
     <w:p>
       <w:pPr>
@@ -7230,6 +7482,7 @@
       </w:r>
     </w:p>
     <w:p>
+      <w:bookmarkStart w:id="5" w:name="ch5"/>
       <w:pPr>
         <w:pStyle w:val="Heading1"/>
       </w:pPr>
@@ -7240,6 +7493,7 @@
         </w:rPr>
         <w:t>5. Video Segmentation</w:t>
       </w:r>
+      <w:bookmarkEnd w:id="5"/>
     </w:p>
     <w:p>
       <w:pPr>
@@ -8389,6 +8643,7 @@
       </w:r>
     </w:p>
     <w:p>
+      <w:bookmarkStart w:id="6" w:name="ch6"/>
       <w:pPr>
         <w:pStyle w:val="Heading1"/>
       </w:pPr>
@@ -8399,6 +8654,7 @@
         </w:rPr>
         <w:t>6. Face Detection &amp; Mouth Cropping</w:t>
       </w:r>
+      <w:bookmarkEnd w:id="6"/>
     </w:p>
     <w:p>
       <w:pPr>
@@ -9241,6 +9497,7 @@
       </w:r>
     </w:p>
     <w:p>
+      <w:bookmarkStart w:id="7" w:name="ch7"/>
       <w:pPr>
         <w:pStyle w:val="Heading1"/>
       </w:pPr>
@@ -9251,6 +9508,7 @@
         </w:rPr>
         <w:t>7. Reports &amp; Burned Videos</w:t>
       </w:r>
+      <w:bookmarkEnd w:id="7"/>
     </w:p>
     <w:p>
       <w:pPr>
@@ -10796,6 +11054,7 @@
       </w:r>
     </w:p>
     <w:p>
+      <w:bookmarkStart w:id="8" w:name="ch8"/>
       <w:pPr>
         <w:pStyle w:val="Heading1"/>
       </w:pPr>
@@ -10806,6 +11065,7 @@
         </w:rPr>
         <w:t>8. Modular Code Refactoring</w:t>
       </w:r>
+      <w:bookmarkEnd w:id="8"/>
     </w:p>
     <w:p>
       <w:pPr>
@@ -13244,6 +13504,7 @@
       </w:r>
     </w:p>
     <w:p>
+      <w:bookmarkStart w:id="9" w:name="ch9"/>
       <w:pPr>
         <w:pStyle w:val="Heading1"/>
       </w:pPr>
@@ -13254,6 +13515,7 @@
         </w:rPr>
         <w:t>9. Web UI &amp; Server</w:t>
       </w:r>
+      <w:bookmarkEnd w:id="9"/>
     </w:p>
     <w:p>
       <w:pPr>
@@ -16183,6 +16445,7 @@
       </w:r>
     </w:p>
     <w:p>
+      <w:bookmarkStart w:id="10" w:name="ch10"/>
       <w:pPr>
         <w:pStyle w:val="Heading1"/>
       </w:pPr>
@@ -16193,6 +16456,7 @@
         </w:rPr>
         <w:t>10. Backend Services</w:t>
       </w:r>
+      <w:bookmarkEnd w:id="10"/>
     </w:p>
     <w:p>
       <w:pPr>
@@ -16767,6 +17031,7 @@
       </w:r>
     </w:p>
     <w:p>
+      <w:bookmarkStart w:id="11" w:name="ch11"/>
       <w:pPr>
         <w:pStyle w:val="Heading1"/>
       </w:pPr>
@@ -16777,6 +17042,7 @@
         </w:rPr>
         <w:t>11. Docker Container &amp; Deployment</w:t>
       </w:r>
+      <w:bookmarkEnd w:id="11"/>
     </w:p>
     <w:p>
       <w:pPr>
@@ -19186,6 +19452,7 @@
       </w:r>
     </w:p>
     <w:p>
+      <w:bookmarkStart w:id="12" w:name="ch12"/>
       <w:pPr>
         <w:pStyle w:val="Heading1"/>
       </w:pPr>
@@ -19196,6 +19463,7 @@
         </w:rPr>
         <w:t>12. Performance Evaluation &amp; Tuning</w:t>
       </w:r>
+      <w:bookmarkEnd w:id="12"/>
     </w:p>
     <w:p>
       <w:pPr>
@@ -22203,6 +22471,7 @@
       </w:r>
     </w:p>
     <w:p>
+      <w:bookmarkStart w:id="13" w:name="ch13"/>
       <w:pPr>
         <w:pStyle w:val="Heading1"/>
       </w:pPr>
@@ -22213,6 +22482,7 @@
         </w:rPr>
         <w:t>13. Fine-Tuning &amp; Training Infrastructure</w:t>
       </w:r>
+      <w:bookmarkEnd w:id="13"/>
     </w:p>
     <w:p>
       <w:pPr>
@@ -23879,6 +24149,7 @@
       </w:r>
     </w:p>
     <w:p>
+      <w:bookmarkStart w:id="14" w:name="ch14"/>
       <w:pPr>
         <w:pStyle w:val="Heading1"/>
       </w:pPr>
@@ -23889,6 +24160,7 @@
         </w:rPr>
         <w:t>14. Executive Summary</w:t>
       </w:r>
+      <w:bookmarkEnd w:id="14"/>
     </w:p>
     <w:p>
       <w:pPr>

</xml_diff>